<commit_message>
docs(portal): HDSD noi dung pham vi chot 3 - chi canh don gia cac dong bao gia
Co-Authored-By: Claude Opus 5.5 <noreply@anthropic.com>
</commit_message>
<xml_diff>
--- a/docs/HDSD-gia-theo-bang-gia-va-thoi-gian-giao-hang.docx
+++ b/docs/HDSD-gia-theo-bang-gia-va-thoi-gian-giao-hang.docx
@@ -1419,7 +1419,7 @@
           <w:b w:val="0"/>
           <w:i w:val="0"/>
         </w:rPr>
-        <w:t>Người đặt thẳng (quản lý) thấy thông báo "Đã tạo 2 đơn: 1 đơn đặt ngay, 1 đơn chờ báo giá."</w:t>
+        <w:t>Người đặt thẳng (quản lý) thấy thông báo "Đã tạo 2 đơn: 1 đơn đặt ngay, 1 đơn chờ báo giá." Trong danh sách, cột GIÁ TRỊ của đơn chờ báo giá hiện "0 ₫" cho tới khi Miyano báo giá.</w:t>
       </w:r>
     </w:p>
     <w:p>
@@ -3323,7 +3323,21 @@
                 <w:b w:val="0"/>
                 <w:i w:val="0"/>
               </w:rPr>
-              <w:t>Sau khi khách đồng ý mà đơn giá trên đơn khác giá khách đã đồng ý</w:t>
+              <w:t xml:space="preserve">Sau khi khách đồng ý mà đơn giá của một </w:t>
+            </w:r>
+            <w:r>
+              <w:rPr>
+                <w:b/>
+                <w:i w:val="0"/>
+              </w:rPr>
+              <w:t>dòng báo giá</w:t>
+            </w:r>
+            <w:r>
+              <w:rPr>
+                <w:b w:val="0"/>
+                <w:i w:val="0"/>
+              </w:rPr>
+              <w:t xml:space="preserve"> khác giá khách đã đồng ý</w:t>
             </w:r>
           </w:p>
         </w:tc>
@@ -3445,6 +3459,80 @@
           <w:i/>
         </w:rPr>
         <w:t>Hình 17 – Chốt 1: đơn có hàng chờ báo giá không đi thẳng "Gửi duyệt" được</w:t>
+      </w:r>
+    </w:p>
+    <w:p>
+      <w:pPr>
+        <w:pStyle w:val="IntenseQuote"/>
+      </w:pPr>
+      <w:r>
+        <w:rPr>
+          <w:b w:val="0"/>
+          <w:i w:val="0"/>
+        </w:rPr>
+        <w:t xml:space="preserve">Chốt 3 chỉ canh các dòng có Nguồn giá là </w:t>
+      </w:r>
+      <w:r>
+        <w:rPr>
+          <w:rFonts w:ascii="Consolas" w:hAnsi="Consolas"/>
+          <w:b w:val="0"/>
+          <w:i w:val="0"/>
+          <w:color w:val="B03030"/>
+          <w:sz w:val="19"/>
+        </w:rPr>
+        <w:t>Báo giá</w:t>
+      </w:r>
+      <w:r>
+        <w:rPr>
+          <w:b w:val="0"/>
+          <w:i w:val="0"/>
+        </w:rPr>
+        <w:t xml:space="preserve">. Dòng </w:t>
+      </w:r>
+      <w:r>
+        <w:rPr>
+          <w:rFonts w:ascii="Consolas" w:hAnsi="Consolas"/>
+          <w:b w:val="0"/>
+          <w:i w:val="0"/>
+          <w:color w:val="B03030"/>
+          <w:sz w:val="19"/>
+        </w:rPr>
+        <w:t>Bảng giá</w:t>
+      </w:r>
+      <w:r>
+        <w:rPr>
+          <w:b w:val="0"/>
+          <w:i w:val="0"/>
+        </w:rPr>
+        <w:t xml:space="preserve"> nằm chung trong đơn báo giá, số lượng và dòng thêm mới </w:t>
+      </w:r>
+      <w:r>
+        <w:rPr>
+          <w:b/>
+          <w:i w:val="0"/>
+        </w:rPr>
+        <w:t>không</w:t>
+      </w:r>
+      <w:r>
+        <w:rPr>
+          <w:b w:val="0"/>
+          <w:i w:val="0"/>
+        </w:rPr>
+        <w:t xml:space="preserve"> được canh: sửa những thứ đó sau khi khách đồng ý thì nhân viên phải tự bấm </w:t>
+      </w:r>
+      <w:r>
+        <w:rPr>
+          <w:b/>
+          <w:i w:val="0"/>
+        </w:rPr>
+        <w:t>Gửi khách duyệt</w:t>
+      </w:r>
+      <w:r>
+        <w:rPr>
+          <w:b w:val="0"/>
+          <w:i w:val="0"/>
+        </w:rPr>
+        <w:t xml:space="preserve"> lại.</w:t>
       </w:r>
     </w:p>
     <w:p>
@@ -5294,7 +5382,7 @@
                 <w:b w:val="0"/>
                 <w:i w:val="0"/>
               </w:rPr>
-              <w:t xml:space="preserve">Đơn giá đã bị sửa sau khi khách đồng ý. Bấm </w:t>
+              <w:t xml:space="preserve">Đơn giá của một dòng báo giá đã bị sửa sau khi khách đồng ý. Bấm </w:t>
             </w:r>
             <w:r>
               <w:rPr>
@@ -5443,14 +5531,31 @@
           <w:b/>
           <w:i w:val="0"/>
         </w:rPr>
-        <w:t>Không chặn sửa số lượng sau khi khách đồng ý.</w:t>
+        <w:t xml:space="preserve">Không chặn sửa số lượng, thêm dòng, hay sửa giá dòng </w:t>
+      </w:r>
+      <w:r>
+        <w:rPr>
+          <w:rFonts w:ascii="Consolas" w:hAnsi="Consolas"/>
+          <w:b/>
+          <w:i w:val="0"/>
+          <w:color w:val="B03030"/>
+          <w:sz w:val="19"/>
+        </w:rPr>
+        <w:t>Bảng giá</w:t>
+      </w:r>
+      <w:r>
+        <w:rPr>
+          <w:b/>
+          <w:i w:val="0"/>
+        </w:rPr>
+        <w:t xml:space="preserve"> sau khi khách đồng ý.</w:t>
       </w:r>
       <w:r>
         <w:rPr>
           <w:b w:val="0"/>
           <w:i w:val="0"/>
         </w:rPr>
-        <w:t xml:space="preserve"> Chốt 3 chỉ canh đơn giá.</w:t>
+        <w:t xml:space="preserve"> Chốt 3 chỉ canh đơn giá của các dòng báo giá.</w:t>
       </w:r>
     </w:p>
     <w:p>

</xml_diff>